<commit_message>
Daylis 15 sprint 2 mas video de evidencia del proyecto
</commit_message>
<xml_diff>
--- a/Fase dos/Documentacion Scrum/Sprint 2/Daylis/Dailys 14- Sprint 2.docx
+++ b/Fase dos/Documentacion Scrum/Sprint 2/Daylis/Dailys 14- Sprint 2.docx
@@ -91,7 +91,7 @@
         <w:t>1</w:t>
       </w:r>
       <w:r>
-        <w:t>5</w:t>
+        <w:t>6</w:t>
       </w:r>
       <w:r>
         <w:t>/</w:t>
@@ -123,7 +123,7 @@
         <w:t>1</w:t>
       </w:r>
       <w:r>
-        <w:t>4</w:t>
+        <w:t>5</w:t>
       </w:r>
     </w:p>
     <w:p>
@@ -255,11 +255,13 @@
         <w:ind w:left="1776"/>
       </w:pPr>
       <w:r>
-        <w:t>(</w:t>
-      </w:r>
-      <w:r>
-        <w:t>Aprobaba)</w:t>
-      </w:r>
+        <w:t>(revisión)</w:t>
+      </w:r>
+    </w:p>
+    <w:p>
+      <w:pPr>
+        <w:pStyle w:val="Prrafodelista"/>
+      </w:pPr>
     </w:p>
     <w:p>
       <w:pPr>

</xml_diff>